<commit_message>
Risk: edit everything about a risk from its drawer; slim the Manage tab
The family wanted one editing surface, not per-risk edits split between the
Manage tab and the risk drawer.

- Risk drawer (admin): new "✎ Edit risk details" inline editor — domain, number,
  title, description, accountable — plus "Retire risk" / "Restore risk"
  (PUT /api/risk/categories/:id). So a risk's details, scoring, rationale,
  mitigations, actions, notes and events are all edited in one screen.
- Register: "+ Add risk" button (admin) opens a create modal then the new risk's
  drawer; "Show retired" checkbox surfaces retired risks (dimmed) so they can be
  reopened and restored.
- Manage tab: dropped the per-category taxonomy editor (TaxonomyEditor/CatEdit).
  It now holds only genuinely global config — domain names, scoring-scale
  labels, roles, review reminder.

Co-Authored-By: Claude Sonnet 5 <noreply@anthropic.com>
</commit_message>
<xml_diff>
--- a/RFO_Risk_App_BuildSpec_v1.docx
+++ b/RFO_Risk_App_BuildSpec_v1.docx
@@ -10988,113 +10988,27 @@
         <w:spacing w:after="60" w:line="290"/>
       </w:pPr>
       <w:r>
-        <w:t xml:space="preserve">Click a row → the </w:t>
-      </w:r>
-      <w:r>
-        <w:rPr>
-          <w:b/>
-          <w:bCs/>
-        </w:rPr>
-        <w:t xml:space="preserve">Risk detail</w:t>
-      </w:r>
-      <w:r>
-        <w:t xml:space="preserve"> drawer (§6.2).</w:t>
-      </w:r>
-    </w:p>
-    <w:p>
-      <w:pPr>
-        <w:pStyle w:val="Heading2"/>
-        <w:spacing w:after="100" w:before="220"/>
-      </w:pPr>
-      <w:r>
-        <w:t xml:space="preserve">6.2 Risk detail drawer — the single place a risk is managed</w:t>
-      </w:r>
-    </w:p>
-    <w:p>
-      <w:pPr>
-        <w:spacing w:after="140" w:line="300"/>
-      </w:pPr>
-      <w:r>
-        <w:t xml:space="preserve">Opens from a Register row or any Profile rollup row. Read-only for viewers; editable for member/admin. Header (sticky) shows number, title, description, the </w:t>
-      </w:r>
-      <w:r>
-        <w:rPr>
-          <w:b/>
-          <w:bCs/>
-        </w:rPr>
-        <w:t xml:space="preserve">Inherent → Residual</w:t>
-      </w:r>
-      <w:r>
-        <w:t xml:space="preserve"> score chips, Status pill and next-review.</w:t>
-      </w:r>
-    </w:p>
-    <w:p>
-      <w:pPr>
-        <w:spacing w:after="140" w:line="300"/>
-      </w:pPr>
-      <w:r>
-        <w:rPr>
-          <w:b/>
-          <w:bCs/>
-        </w:rPr>
-        <w:t xml:space="preserve">No sub-tabs.</w:t>
-      </w:r>
-      <w:r>
-        <w:t xml:space="preserve"> The body is one scrolling panel with every attribute of the risk managed together, in this order: Current scoring → Scoring rationale → Key mitigations in place → </w:t>
-      </w:r>
-      <w:r>
-        <w:rPr>
-          <w:b/>
-          <w:bCs/>
-        </w:rPr>
-        <w:t xml:space="preserve">Required actions</w:t>
-      </w:r>
-      <w:r>
-        <w:t xml:space="preserve"> (with the per-action Family-Task-List sync toggle, §6.5) → Notes → Accountable → a collapsible </w:t>
-      </w:r>
-      <w:r>
-        <w:rPr>
-          <w:b/>
-          <w:bCs/>
-        </w:rPr>
-        <w:t xml:space="preserve">Events</w:t>
-      </w:r>
-      <w:r>
-        <w:t xml:space="preserve"> section → a collapsible </w:t>
-      </w:r>
-      <w:r>
-        <w:rPr>
-          <w:b/>
-          <w:bCs/>
-        </w:rPr>
-        <w:t xml:space="preserve">Assessment history</w:t>
-      </w:r>
-      <w:r>
-        <w:t xml:space="preserve"> section. The </w:t>
-      </w:r>
-      <w:r>
-        <w:rPr>
-          <w:rFonts w:ascii="Consolas" w:cs="Consolas" w:eastAsia="Consolas" w:hAnsi="Consolas"/>
-          <w:color w:val="2B2B2B"/>
-          <w:sz w:val="19"/>
-          <w:szCs w:val="19"/>
-        </w:rPr>
-        <w:t xml:space="preserve">.modal</w:t>
-      </w:r>
-      <w:r>
-        <w:t xml:space="preserve"> gets </w:t>
-      </w:r>
-      <w:r>
-        <w:rPr>
-          <w:rFonts w:ascii="Consolas" w:cs="Consolas" w:eastAsia="Consolas" w:hAnsi="Consolas"/>
-          <w:color w:val="2B2B2B"/>
-          <w:sz w:val="19"/>
-          <w:szCs w:val="19"/>
-        </w:rPr>
-        <w:t xml:space="preserve">max-height: calc(100vh - 48px); overflow-y: auto</w:t>
-      </w:r>
-      <w:r>
-        <w:t xml:space="preserve"> so the panel scrolls internally.</w:t>
+        <w:t xml:space="preserve">Filter row also has a </w:t>
+      </w:r>
+      <w:r>
+        <w:rPr>
+          <w:b/>
+          <w:bCs/>
+        </w:rPr>
+        <w:t xml:space="preserve">"Show retired"</w:t>
+      </w:r>
+      <w:r>
+        <w:t xml:space="preserve"> checkbox (retired risks render dimmed with a "(retired)" tag; open one to restore it) and, for admins, a </w:t>
+      </w:r>
+      <w:r>
+        <w:rPr>
+          <w:b/>
+          <w:bCs/>
+        </w:rPr>
+        <w:t xml:space="preserve">"+ Add risk"</w:t>
+      </w:r>
+      <w:r>
+        <w:t xml:space="preserve"> button → a small modal (domain, title, description, accountable) that creates the category and opens its drawer.</w:t>
       </w:r>
     </w:p>
     <w:p>
@@ -11107,6 +11021,199 @@
         <w:spacing w:after="60" w:line="290"/>
       </w:pPr>
       <w:r>
+        <w:t xml:space="preserve">Click a row → the </w:t>
+      </w:r>
+      <w:r>
+        <w:rPr>
+          <w:b/>
+          <w:bCs/>
+        </w:rPr>
+        <w:t xml:space="preserve">Risk detail</w:t>
+      </w:r>
+      <w:r>
+        <w:t xml:space="preserve"> drawer (§6.2).</w:t>
+      </w:r>
+    </w:p>
+    <w:p>
+      <w:pPr>
+        <w:pStyle w:val="Heading2"/>
+        <w:spacing w:after="100" w:before="220"/>
+      </w:pPr>
+      <w:r>
+        <w:t xml:space="preserve">6.2 Risk detail drawer — the single place a risk is managed</w:t>
+      </w:r>
+    </w:p>
+    <w:p>
+      <w:pPr>
+        <w:spacing w:after="140" w:line="300"/>
+      </w:pPr>
+      <w:r>
+        <w:t xml:space="preserve">Opens from a Register row or any Profile rollup row. Read-only for viewers; editable for member/admin. Header (sticky) shows number, title, description, the </w:t>
+      </w:r>
+      <w:r>
+        <w:rPr>
+          <w:b/>
+          <w:bCs/>
+        </w:rPr>
+        <w:t xml:space="preserve">Inherent → Residual</w:t>
+      </w:r>
+      <w:r>
+        <w:t xml:space="preserve"> score chips, Status pill and next-review.</w:t>
+      </w:r>
+    </w:p>
+    <w:p>
+      <w:pPr>
+        <w:spacing w:after="140" w:line="300"/>
+      </w:pPr>
+      <w:r>
+        <w:rPr>
+          <w:b/>
+          <w:bCs/>
+        </w:rPr>
+        <w:t xml:space="preserve">No sub-tabs.</w:t>
+      </w:r>
+      <w:r>
+        <w:t xml:space="preserve"> The body is one scrolling panel with every attribute of the risk managed together, in this order: </w:t>
+      </w:r>
+      <w:r>
+        <w:rPr>
+          <w:b/>
+          <w:bCs/>
+        </w:rPr>
+        <w:t xml:space="preserve">Risk details editor</w:t>
+      </w:r>
+      <w:r>
+        <w:t xml:space="preserve"> (admin only) → Current scoring → Scoring rationale → Key mitigations in place → </w:t>
+      </w:r>
+      <w:r>
+        <w:rPr>
+          <w:b/>
+          <w:bCs/>
+        </w:rPr>
+        <w:t xml:space="preserve">Required actions</w:t>
+      </w:r>
+      <w:r>
+        <w:t xml:space="preserve"> (with the per-action Family-Task-List sync toggle, §6.5) → Notes → Accountable → a collapsible </w:t>
+      </w:r>
+      <w:r>
+        <w:rPr>
+          <w:b/>
+          <w:bCs/>
+        </w:rPr>
+        <w:t xml:space="preserve">Events</w:t>
+      </w:r>
+      <w:r>
+        <w:t xml:space="preserve"> section → a collapsible </w:t>
+      </w:r>
+      <w:r>
+        <w:rPr>
+          <w:b/>
+          <w:bCs/>
+        </w:rPr>
+        <w:t xml:space="preserve">Assessment history</w:t>
+      </w:r>
+      <w:r>
+        <w:t xml:space="preserve"> section. The </w:t>
+      </w:r>
+      <w:r>
+        <w:rPr>
+          <w:rFonts w:ascii="Consolas" w:cs="Consolas" w:eastAsia="Consolas" w:hAnsi="Consolas"/>
+          <w:color w:val="2B2B2B"/>
+          <w:sz w:val="19"/>
+          <w:szCs w:val="19"/>
+        </w:rPr>
+        <w:t xml:space="preserve">.modal</w:t>
+      </w:r>
+      <w:r>
+        <w:t xml:space="preserve"> gets </w:t>
+      </w:r>
+      <w:r>
+        <w:rPr>
+          <w:rFonts w:ascii="Consolas" w:cs="Consolas" w:eastAsia="Consolas" w:hAnsi="Consolas"/>
+          <w:color w:val="2B2B2B"/>
+          <w:sz w:val="19"/>
+          <w:szCs w:val="19"/>
+        </w:rPr>
+        <w:t xml:space="preserve">max-height: calc(100vh - 48px); overflow-y: auto</w:t>
+      </w:r>
+      <w:r>
+        <w:t xml:space="preserve"> so the panel scrolls internally.</w:t>
+      </w:r>
+    </w:p>
+    <w:p>
+      <w:pPr>
+        <w:pStyle w:val="ListParagraph"/>
+        <w:numPr>
+          <w:ilvl w:val="0"/>
+          <w:numId w:val="1"/>
+        </w:numPr>
+        <w:spacing w:after="60" w:line="290"/>
+      </w:pPr>
+      <w:r>
+        <w:rPr>
+          <w:b/>
+          <w:bCs/>
+        </w:rPr>
+        <w:t xml:space="preserve">Risk details editor</w:t>
+      </w:r>
+      <w:r>
+        <w:t xml:space="preserve"> (admin, collapsed behind an "✎ Edit risk details" link): domain, number, title, one-line description, accountable — inline, saved via </w:t>
+      </w:r>
+      <w:r>
+        <w:rPr>
+          <w:rFonts w:ascii="Consolas" w:cs="Consolas" w:eastAsia="Consolas" w:hAnsi="Consolas"/>
+          <w:color w:val="2B2B2B"/>
+          <w:sz w:val="19"/>
+          <w:szCs w:val="19"/>
+        </w:rPr>
+        <w:t xml:space="preserve">PUT /api/risk/categories/:id</w:t>
+      </w:r>
+      <w:r>
+        <w:t xml:space="preserve"> — plus a </w:t>
+      </w:r>
+      <w:r>
+        <w:rPr>
+          <w:b/>
+          <w:bCs/>
+        </w:rPr>
+        <w:t xml:space="preserve">Retire risk / Restore risk</w:t>
+      </w:r>
+      <w:r>
+        <w:t xml:space="preserve"> toggle (</w:t>
+      </w:r>
+      <w:r>
+        <w:rPr>
+          <w:rFonts w:ascii="Consolas" w:cs="Consolas" w:eastAsia="Consolas" w:hAnsi="Consolas"/>
+          <w:color w:val="2B2B2B"/>
+          <w:sz w:val="19"/>
+          <w:szCs w:val="19"/>
+        </w:rPr>
+        <w:t xml:space="preserve">PUT … {isActive}</w:t>
+      </w:r>
+      <w:r>
+        <w:t xml:space="preserve">). This is the </w:t>
+      </w:r>
+      <w:r>
+        <w:rPr>
+          <w:i/>
+          <w:iCs/>
+        </w:rPr>
+        <w:t xml:space="preserve">only</w:t>
+      </w:r>
+      <w:r>
+        <w:t xml:space="preserve"> place an individual risk's descriptive attributes are edited; the Manage tab no longer carries a per-category edit form (§6.6). Everything about a risk — its details, scoring, rationale, mitigations, actions, notes, events — is edited here, in one screen.</w:t>
+      </w:r>
+    </w:p>
+    <w:p>
+      <w:pPr>
+        <w:pStyle w:val="ListParagraph"/>
+        <w:numPr>
+          <w:ilvl w:val="0"/>
+          <w:numId w:val="1"/>
+        </w:numPr>
+        <w:spacing w:after="60" w:line="290"/>
+      </w:pPr>
+      <w:r>
         <w:rPr>
           <w:b/>
           <w:bCs/>
@@ -12525,6 +12632,14 @@
     </w:p>
     <w:p>
       <w:pPr>
+        <w:spacing w:after="140" w:line="300"/>
+      </w:pPr>
+      <w:r>
+        <w:t xml:space="preserve">Only the genuinely global, non-per-risk configuration lives here — everything about an individual risk (details, retire/restore, scoring, mitigations, actions, notes) is managed from that risk's drawer (§6.2), and "+ Add risk" lives on the Register (§6.1).</w:t>
+      </w:r>
+    </w:p>
+    <w:p>
+      <w:pPr>
         <w:pStyle w:val="ListParagraph"/>
         <w:numPr>
           <w:ilvl w:val="0"/>
@@ -12537,22 +12652,22 @@
           <w:b/>
           <w:bCs/>
         </w:rPr>
-        <w:t xml:space="preserve">Taxonomy editor:</w:t>
-      </w:r>
-      <w:r>
-        <w:t xml:space="preserve"> rename domains; add / rename / retire (</w:t>
-      </w:r>
-      <w:r>
-        <w:rPr>
-          <w:rFonts w:ascii="Consolas" w:cs="Consolas" w:eastAsia="Consolas" w:hAnsi="Consolas"/>
-          <w:color w:val="2B2B2B"/>
-          <w:sz w:val="19"/>
-          <w:szCs w:val="19"/>
-        </w:rPr>
-        <w:t xml:space="preserve">is_active = 0</w:t>
-      </w:r>
-      <w:r>
-        <w:t xml:space="preserve">) categories; edit a category's description, accountable text, and notes; reorder. Retiring a category hides it from the register but keeps its assessments/events/actions for history and the trend. Adding a category requires domain + title + description; it enters the register with no assessment until someone runs one (shows as "Not yet assessed").</w:t>
+        <w:t xml:space="preserve">Domains:</w:t>
+      </w:r>
+      <w:r>
+        <w:t xml:space="preserve"> rename a domain (</w:t>
+      </w:r>
+      <w:r>
+        <w:rPr>
+          <w:rFonts w:ascii="Consolas" w:cs="Consolas" w:eastAsia="Consolas" w:hAnsi="Consolas"/>
+          <w:color w:val="2B2B2B"/>
+          <w:sz w:val="19"/>
+          <w:szCs w:val="19"/>
+        </w:rPr>
+        <w:t xml:space="preserve">PUT /api/risk/domains/:id</w:t>
+      </w:r>
+      <w:r>
+        <w:t xml:space="preserve">). That's it — no per-category list.</w:t>
       </w:r>
     </w:p>
     <w:p>

</xml_diff>

<commit_message>
Risk: add new domains, drop "v5" label, label the heatmap bubbles
- Add domains: new POST /api/risk/domains (admin) — id is the next free single
  letter A–Z, auto-assigned; "+ Add domain" on the Manage tab's Domains card.
  New category / edit-details domain selects pick it up automatically.
- Drop the "v5" version label from the app: the page subhead is now
  "Robinson Family Office — Enterprise Risk Register", and the seed strings,
  IPS context note and README no longer call the live register "v5" (the source
  spreadsheet/notes filenames still carry it as provenance).
- Heatmap: draw the risk number on every bubble (inline afterDatasetsDraw
  plugin, on-screen and in the PDF report); spread co-located risks around the
  cell centre (phyllotaxis) instead of a self-overlapping diagonal; add a
  clickable "#N — Title" key beneath the chart. Bubbles are now identifiable.

Co-Authored-By: Claude Sonnet 5 <noreply@anthropic.com>
</commit_message>
<xml_diff>
--- a/RFO_Risk_App_BuildSpec_v1.docx
+++ b/RFO_Risk_App_BuildSpec_v1.docx
@@ -40,7 +40,7 @@
           <w:sz w:val="18"/>
           <w:szCs w:val="18"/>
         </w:rPr>
-        <w:t xml:space="preserve">Version 1  ·  Robinson Family Office  ·  2026-09-08</w:t>
+        <w:t xml:space="preserve">Version 1  ·  Robinson Family Office  ·  2026-09-09</w:t>
       </w:r>
     </w:p>
     <w:p>
@@ -11850,19 +11850,7 @@
         <w:t xml:space="preserve">4×4 heatmap</w:t>
       </w:r>
       <w:r>
-        <w:t xml:space="preserve"> (Probability 1–4 on one axis, Impact 1–4 on the other), each cell tinted Low/Med/High by </w:t>
-      </w:r>
-      <w:r>
-        <w:rPr>
-          <w:rFonts w:ascii="Consolas" w:cs="Consolas" w:eastAsia="Consolas" w:hAnsi="Consolas"/>
-          <w:color w:val="2B2B2B"/>
-          <w:sz w:val="19"/>
-          <w:szCs w:val="19"/>
-        </w:rPr>
-        <w:t xml:space="preserve">P×I</w:t>
-      </w:r>
-      <w:r>
-        <w:t xml:space="preserve">. Every category is a dot in its cell at the current </w:t>
+        <w:t xml:space="preserve"> (Probability 1–4 on one axis, Impact 1–4 on the other). Every category is a bubble at its current </w:t>
       </w:r>
       <w:r>
         <w:rPr>
@@ -11872,7 +11860,51 @@
         <w:t xml:space="preserve">residual</w:t>
       </w:r>
       <w:r>
-        <w:t xml:space="preserve"> score (toggle to inherent). Dots in the same cell fan out; hover shows the title; click opens the detail drawer. Build with Chart.js </w:t>
+        <w:t xml:space="preserve"> score (toggle to inherent), coloured by band. Co-located risks spread around the cell centre (phyllotaxis offset) so each bubble is separately visible; an inline Chart.js plugin (</w:t>
+      </w:r>
+      <w:r>
+        <w:rPr>
+          <w:rFonts w:ascii="Consolas" w:cs="Consolas" w:eastAsia="Consolas" w:hAnsi="Consolas"/>
+          <w:color w:val="2B2B2B"/>
+          <w:sz w:val="19"/>
+          <w:szCs w:val="19"/>
+        </w:rPr>
+        <w:t xml:space="preserve">afterDatasetsDraw</w:t>
+      </w:r>
+      <w:r>
+        <w:t xml:space="preserve">) draws the </w:t>
+      </w:r>
+      <w:r>
+        <w:rPr>
+          <w:b/>
+          <w:bCs/>
+        </w:rPr>
+        <w:t xml:space="preserve">risk number</w:t>
+      </w:r>
+      <w:r>
+        <w:t xml:space="preserve"> on each bubble; hover shows the title; click opens the drawer. Below the chart, a </w:t>
+      </w:r>
+      <w:r>
+        <w:rPr>
+          <w:b/>
+          <w:bCs/>
+        </w:rPr>
+        <w:t xml:space="preserve">key</w:t>
+      </w:r>
+      <w:r>
+        <w:t xml:space="preserve"> lists every </w:t>
+      </w:r>
+      <w:r>
+        <w:rPr>
+          <w:rFonts w:ascii="Consolas" w:cs="Consolas" w:eastAsia="Consolas" w:hAnsi="Consolas"/>
+          <w:color w:val="2B2B2B"/>
+          <w:sz w:val="19"/>
+          <w:szCs w:val="19"/>
+        </w:rPr>
+        <w:t xml:space="preserve">#N — Title</w:t>
+      </w:r>
+      <w:r>
+        <w:t xml:space="preserve"> with a band-colour dot, each entry clickable to open that risk. The same number-on-bubble treatment is applied to the PDF report's heatmap. Build with Chart.js </w:t>
       </w:r>
       <w:r>
         <w:rPr>
@@ -11884,7 +11916,7 @@
         <w:t xml:space="preserve">scatter</w:t>
       </w:r>
       <w:r>
-        <w:t xml:space="preserve"> (integer axes) or a hand-drawn CSS grid — either is fine; the Expenditure app's </w:t>
+        <w:t xml:space="preserve"> (integer axes); the Expenditure app's </w:t>
       </w:r>
       <w:r>
         <w:rPr>
@@ -11896,7 +11928,7 @@
         <w:t xml:space="preserve">ChartCanvas</w:t>
       </w:r>
       <w:r>
-        <w:t xml:space="preserve"> wrapper is the reference if using Chart.js.</w:t>
+        <w:t xml:space="preserve"> wrapper is the reference.</w:t>
       </w:r>
     </w:p>
     <w:p>
@@ -12655,7 +12687,19 @@
         <w:t xml:space="preserve">Domains:</w:t>
       </w:r>
       <w:r>
-        <w:t xml:space="preserve"> rename a domain (</w:t>
+        <w:t xml:space="preserve"> add a domain (</w:t>
+      </w:r>
+      <w:r>
+        <w:rPr>
+          <w:rFonts w:ascii="Consolas" w:cs="Consolas" w:eastAsia="Consolas" w:hAnsi="Consolas"/>
+          <w:color w:val="2B2B2B"/>
+          <w:sz w:val="19"/>
+          <w:szCs w:val="19"/>
+        </w:rPr>
+        <w:t xml:space="preserve">POST /api/risk/domains</w:t>
+      </w:r>
+      <w:r>
+        <w:t xml:space="preserve"> — id is the next free single letter A–Z, auto-assigned; a new empty domain shows on the Register once it has a risk) or rename one (</w:t>
       </w:r>
       <w:r>
         <w:rPr>
@@ -12667,7 +12711,7 @@
         <w:t xml:space="preserve">PUT /api/risk/domains/:id</w:t>
       </w:r>
       <w:r>
-        <w:t xml:space="preserve">). That's it — no per-category list.</w:t>
+        <w:t xml:space="preserve">). No per-category list.</w:t>
       </w:r>
     </w:p>
     <w:p>
@@ -14509,28 +14553,40 @@
         <w:t xml:space="preserve">POST/PUT/DELETE /api/risk/categories</w:t>
       </w:r>
       <w:r>
-        <w:t xml:space="preserve"> and </w:t>
-      </w:r>
-      <w:r>
-        <w:rPr>
-          <w:rFonts w:ascii="Consolas" w:cs="Consolas" w:eastAsia="Consolas" w:hAnsi="Consolas"/>
-          <w:color w:val="2B2B2B"/>
-          <w:sz w:val="19"/>
-          <w:szCs w:val="19"/>
-        </w:rPr>
-        <w:t xml:space="preserve">…/domains</w:t>
-      </w:r>
-      <w:r>
-        <w:t xml:space="preserve"> and </w:t>
-      </w:r>
-      <w:r>
-        <w:rPr>
-          <w:rFonts w:ascii="Consolas" w:cs="Consolas" w:eastAsia="Consolas" w:hAnsi="Consolas"/>
-          <w:color w:val="2B2B2B"/>
-          <w:sz w:val="19"/>
-          <w:szCs w:val="19"/>
-        </w:rPr>
-        <w:t xml:space="preserve">…/scale</w:t>
+        <w:t xml:space="preserve">, </w:t>
+      </w:r>
+      <w:r>
+        <w:rPr>
+          <w:rFonts w:ascii="Consolas" w:cs="Consolas" w:eastAsia="Consolas" w:hAnsi="Consolas"/>
+          <w:color w:val="2B2B2B"/>
+          <w:sz w:val="19"/>
+          <w:szCs w:val="19"/>
+        </w:rPr>
+        <w:t xml:space="preserve">POST /api/risk/domains</w:t>
+      </w:r>
+      <w:r>
+        <w:t xml:space="preserve"> (add) + </w:t>
+      </w:r>
+      <w:r>
+        <w:rPr>
+          <w:rFonts w:ascii="Consolas" w:cs="Consolas" w:eastAsia="Consolas" w:hAnsi="Consolas"/>
+          <w:color w:val="2B2B2B"/>
+          <w:sz w:val="19"/>
+          <w:szCs w:val="19"/>
+        </w:rPr>
+        <w:t xml:space="preserve">PUT /api/risk/domains/:id</w:t>
+      </w:r>
+      <w:r>
+        <w:t xml:space="preserve"> (rename), and </w:t>
+      </w:r>
+      <w:r>
+        <w:rPr>
+          <w:rFonts w:ascii="Consolas" w:cs="Consolas" w:eastAsia="Consolas" w:hAnsi="Consolas"/>
+          <w:color w:val="2B2B2B"/>
+          <w:sz w:val="19"/>
+          <w:szCs w:val="19"/>
+        </w:rPr>
+        <w:t xml:space="preserve">PUT /api/risk/scale</w:t>
       </w:r>
       <w:r>
         <w:t xml:space="preserve"> — admin only (Manage tab).</w:t>

</xml_diff>